<commit_message>
Modified user stories document, still need to format the pages
</commit_message>
<xml_diff>
--- a/Module 1/User_Stories_Document.docx
+++ b/Module 1/User_Stories_Document.docx
@@ -52,21 +52,12 @@
         </w:rPr>
         <w:t xml:space="preserve">, </w:t>
       </w:r>
-      <w:proofErr w:type="spellStart"/>
       <w:r>
         <w:rPr>
           <w:b/>
           <w:bCs/>
         </w:rPr>
-        <w:t>Aftabur</w:t>
-      </w:r>
-      <w:proofErr w:type="spellEnd"/>
-      <w:r>
-        <w:rPr>
-          <w:b/>
-          <w:bCs/>
-        </w:rPr>
-        <w:t xml:space="preserve"> Rahman</w:t>
+        <w:t>Aftabur Rahman</w:t>
       </w:r>
     </w:p>
     <w:p>
@@ -103,9 +94,320 @@
     </w:p>
     <w:p/>
     <w:p/>
+    <w:p/>
     <w:p>
       <w:r>
         <w:t xml:space="preserve">User Stories: </w:t>
+      </w:r>
+    </w:p>
+    <w:p/>
+    <w:p>
+      <w:r>
+        <w:t xml:space="preserve">UST-01: </w:t>
+      </w:r>
+      <w:r>
+        <w:t xml:space="preserve">Before I sign </w:t>
+      </w:r>
+      <w:r>
+        <w:t>up,</w:t>
+      </w:r>
+      <w:r>
+        <w:t xml:space="preserve"> I want to be able to view the full site without signing up to better evaluate the marina. I want to be able to contact people if I have questions.</w:t>
+      </w:r>
+    </w:p>
+    <w:p>
+      <w:r>
+        <w:t>UST-0</w:t>
+      </w:r>
+      <w:r>
+        <w:t>2</w:t>
+      </w:r>
+      <w:r>
+        <w:t xml:space="preserve">: </w:t>
+      </w:r>
+      <w:r>
+        <w:t xml:space="preserve">As a possible new </w:t>
+      </w:r>
+      <w:r>
+        <w:t>customer,</w:t>
+      </w:r>
+      <w:r>
+        <w:t xml:space="preserve"> I want information on the slip pricing formula, a general 10/ft + 10 </w:t>
+      </w:r>
+      <w:r>
+        <w:t>Elec</w:t>
+      </w:r>
+      <w:r>
+        <w:t xml:space="preserve"> is great, but I want to know what my cost is before providing my info. </w:t>
+      </w:r>
+    </w:p>
+    <w:p>
+      <w:r>
+        <w:t>UST-0</w:t>
+      </w:r>
+      <w:r>
+        <w:t>3</w:t>
+      </w:r>
+      <w:r>
+        <w:t xml:space="preserve">: </w:t>
+      </w:r>
+      <w:r>
+        <w:t xml:space="preserve">As a new customer, I want an easy </w:t>
+      </w:r>
+      <w:r>
+        <w:t>sign-up</w:t>
+      </w:r>
+      <w:r>
+        <w:t xml:space="preserve"> that includes my info with boat information. I want a single signup and reservation page. </w:t>
+      </w:r>
+    </w:p>
+    <w:p>
+      <w:r>
+        <w:t>UST-0</w:t>
+      </w:r>
+      <w:r>
+        <w:t>4</w:t>
+      </w:r>
+      <w:r>
+        <w:t xml:space="preserve">: </w:t>
+      </w:r>
+      <w:r>
+        <w:t xml:space="preserve">As a customer looking to sign up and want an easy-to-follow email verification. I want to be sure that my info is secure and have channels to inform me if something fish happened to my account. </w:t>
+      </w:r>
+    </w:p>
+    <w:p>
+      <w:r>
+        <w:t>UST-0</w:t>
+      </w:r>
+      <w:r>
+        <w:t>5</w:t>
+      </w:r>
+      <w:r>
+        <w:t xml:space="preserve">: </w:t>
+      </w:r>
+      <w:r>
+        <w:t xml:space="preserve">As a registered client I want to be able to login, view the </w:t>
+      </w:r>
+      <w:proofErr w:type="gramStart"/>
+      <w:r>
+        <w:t>site</w:t>
+      </w:r>
+      <w:proofErr w:type="gramEnd"/>
+      <w:r>
+        <w:t xml:space="preserve"> and reserve my slip without annoying re-authentication. </w:t>
+      </w:r>
+    </w:p>
+    <w:p>
+      <w:r>
+        <w:t>UST-0</w:t>
+      </w:r>
+      <w:r>
+        <w:t>6</w:t>
+      </w:r>
+      <w:r>
+        <w:t xml:space="preserve">: </w:t>
+      </w:r>
+      <w:r>
+        <w:t xml:space="preserve">As a user that signed </w:t>
+      </w:r>
+      <w:r>
+        <w:t>in,</w:t>
+      </w:r>
+      <w:r>
+        <w:t xml:space="preserve"> I want to see only the slip information that fits my boat. I </w:t>
+      </w:r>
+      <w:proofErr w:type="gramStart"/>
+      <w:r>
+        <w:t>don’t</w:t>
+      </w:r>
+      <w:proofErr w:type="gramEnd"/>
+      <w:r>
+        <w:t xml:space="preserve"> want information about sizes that </w:t>
+      </w:r>
+      <w:proofErr w:type="gramStart"/>
+      <w:r>
+        <w:t>don’t</w:t>
+      </w:r>
+      <w:proofErr w:type="gramEnd"/>
+      <w:r>
+        <w:t xml:space="preserve"> suit my needs. </w:t>
+      </w:r>
+    </w:p>
+    <w:p>
+      <w:r>
+        <w:t>UST-0</w:t>
+      </w:r>
+      <w:r>
+        <w:t>7</w:t>
+      </w:r>
+      <w:r>
+        <w:t xml:space="preserve">: </w:t>
+      </w:r>
+      <w:r>
+        <w:t xml:space="preserve">As a customer whose boat slip sizes are not available </w:t>
+      </w:r>
+      <w:proofErr w:type="gramStart"/>
+      <w:r>
+        <w:t>at the moment</w:t>
+      </w:r>
+      <w:proofErr w:type="gramEnd"/>
+      <w:r>
+        <w:t xml:space="preserve">, I want to </w:t>
+      </w:r>
+      <w:proofErr w:type="gramStart"/>
+      <w:r>
+        <w:t>be informed</w:t>
+      </w:r>
+      <w:proofErr w:type="gramEnd"/>
+      <w:r>
+        <w:t xml:space="preserve"> that these slips are not </w:t>
+      </w:r>
+      <w:r>
+        <w:t>available and</w:t>
+      </w:r>
+      <w:r>
+        <w:t xml:space="preserve"> have a clear path to </w:t>
+      </w:r>
+      <w:r>
+        <w:t>sign up</w:t>
+      </w:r>
+      <w:r>
+        <w:t xml:space="preserve"> for the waitlist. </w:t>
+      </w:r>
+    </w:p>
+    <w:p>
+      <w:r>
+        <w:t>UST-0</w:t>
+      </w:r>
+      <w:r>
+        <w:t>8</w:t>
+      </w:r>
+      <w:r>
+        <w:t xml:space="preserve">: </w:t>
+      </w:r>
+      <w:r>
+        <w:t xml:space="preserve">As a customer </w:t>
+      </w:r>
+      <w:proofErr w:type="gramStart"/>
+      <w:r>
+        <w:t>who’s</w:t>
+      </w:r>
+      <w:proofErr w:type="gramEnd"/>
+      <w:r>
+        <w:t xml:space="preserve"> on slip is not, I want to know how </w:t>
+      </w:r>
+      <w:proofErr w:type="gramStart"/>
+      <w:r>
+        <w:t>many</w:t>
+      </w:r>
+      <w:proofErr w:type="gramEnd"/>
+      <w:r>
+        <w:t xml:space="preserve"> people are ahead of me so I can decide whether to join the </w:t>
+      </w:r>
+      <w:r>
+        <w:t>waitlist.</w:t>
+      </w:r>
+    </w:p>
+    <w:p>
+      <w:r>
+        <w:t>UST-0</w:t>
+      </w:r>
+      <w:r>
+        <w:t>9</w:t>
+      </w:r>
+      <w:r>
+        <w:t xml:space="preserve">: </w:t>
+      </w:r>
+      <w:r>
+        <w:t xml:space="preserve">As I signed </w:t>
+      </w:r>
+      <w:r>
+        <w:t>up with a</w:t>
+      </w:r>
+      <w:r>
+        <w:t xml:space="preserve"> client, I want a detailed </w:t>
+      </w:r>
+      <w:r>
+        <w:t>summary</w:t>
+      </w:r>
+      <w:r>
+        <w:t xml:space="preserve"> of my reservation. This should include my boat info, slip size, slip number, check-in </w:t>
+      </w:r>
+      <w:proofErr w:type="gramStart"/>
+      <w:r>
+        <w:t>date</w:t>
+      </w:r>
+      <w:proofErr w:type="gramEnd"/>
+      <w:r>
+        <w:t xml:space="preserve"> and total cost for the time reserved. </w:t>
+      </w:r>
+    </w:p>
+    <w:p>
+      <w:r>
+        <w:t>UST-</w:t>
+      </w:r>
+      <w:r>
+        <w:t>10</w:t>
+      </w:r>
+      <w:r>
+        <w:t xml:space="preserve">: </w:t>
+      </w:r>
+      <w:r>
+        <w:t xml:space="preserve">As a returning customer, let me see my reservation ID along with all information about times I had reserved in the past. This should include </w:t>
+      </w:r>
+      <w:r>
+        <w:t>checking</w:t>
+      </w:r>
+      <w:r>
+        <w:t xml:space="preserve"> in dates and slips I used so I can log my details. </w:t>
+      </w:r>
+    </w:p>
+    <w:p>
+      <w:r>
+        <w:t xml:space="preserve">UST-11: As a privacy focused person, I want my name to not </w:t>
+      </w:r>
+      <w:proofErr w:type="gramStart"/>
+      <w:r>
+        <w:t>be disclosed</w:t>
+      </w:r>
+      <w:proofErr w:type="gramEnd"/>
+      <w:r>
+        <w:t xml:space="preserve"> on the waitlist. </w:t>
+      </w:r>
+    </w:p>
+    <w:p>
+      <w:r>
+        <w:t xml:space="preserve">UST-12: As a privacy focused person, I want to know that my password </w:t>
+      </w:r>
+      <w:proofErr w:type="gramStart"/>
+      <w:r>
+        <w:t>is stored</w:t>
+      </w:r>
+      <w:proofErr w:type="gramEnd"/>
+      <w:r>
+        <w:t xml:space="preserve"> hashed and all personal info to </w:t>
+      </w:r>
+      <w:proofErr w:type="gramStart"/>
+      <w:r>
+        <w:t>be protected</w:t>
+      </w:r>
+      <w:proofErr w:type="gramEnd"/>
+      <w:r>
+        <w:t xml:space="preserve">. </w:t>
+      </w:r>
+    </w:p>
+    <w:p>
+      <w:r>
+        <w:lastRenderedPageBreak/>
+        <w:t xml:space="preserve">UST-13: As an active customer, I want to have the ability to cancel my reservation from the summery page. I then want to </w:t>
+      </w:r>
+      <w:proofErr w:type="gramStart"/>
+      <w:r>
+        <w:t>be returned</w:t>
+      </w:r>
+      <w:proofErr w:type="gramEnd"/>
+      <w:r>
+        <w:t xml:space="preserve"> to the reservation page where I can make a new reservation without it affecting my log information. </w:t>
       </w:r>
     </w:p>
     <w:p/>
@@ -114,9 +416,6 @@
     <w:p/>
     <w:p/>
     <w:p/>
-    <w:p/>
-    <w:p/>
-    <w:p/>
     <w:p>
       <w:r>
         <w:t xml:space="preserve">Users: </w:t>
@@ -142,13 +441,19 @@
           <w:numId w:val="1"/>
         </w:numPr>
       </w:pPr>
+      <w:r>
+        <w:t>58-Year-old</w:t>
+      </w:r>
+      <w:r>
+        <w:t xml:space="preserve"> Contractor </w:t>
+      </w:r>
       <w:proofErr w:type="gramStart"/>
       <w:r>
-        <w:t>58 Year old</w:t>
+        <w:t>that’s</w:t>
       </w:r>
       <w:proofErr w:type="gramEnd"/>
       <w:r>
-        <w:t xml:space="preserve"> Contractor that’s almost retired </w:t>
+        <w:t xml:space="preserve"> almost retired </w:t>
       </w:r>
     </w:p>
     <w:p>
@@ -239,11 +544,9 @@
           <w:numId w:val="1"/>
         </w:numPr>
       </w:pPr>
-      <w:proofErr w:type="gramStart"/>
-      <w:r>
-        <w:t>45 year old</w:t>
-      </w:r>
-      <w:proofErr w:type="gramEnd"/>
+      <w:r>
+        <w:t>45-year-old</w:t>
+      </w:r>
       <w:r>
         <w:t xml:space="preserve"> Fishery Consultant </w:t>
       </w:r>
@@ -269,7 +572,6 @@
         <w:rPr>
           <w:noProof/>
         </w:rPr>
-        <w:lastRenderedPageBreak/>
         <w:drawing>
           <wp:inline distT="0" distB="0" distL="0" distR="0" wp14:anchorId="2C562BD5" wp14:editId="473E23FA">
             <wp:extent cx="2923300" cy="1645920"/>
@@ -345,11 +647,9 @@
           <w:numId w:val="1"/>
         </w:numPr>
       </w:pPr>
-      <w:proofErr w:type="gramStart"/>
-      <w:r>
-        <w:t>62 year old</w:t>
-      </w:r>
-      <w:proofErr w:type="gramEnd"/>
+      <w:r>
+        <w:t>62-year-old</w:t>
+      </w:r>
       <w:r>
         <w:t xml:space="preserve"> fishing boat captain (retired)  </w:t>
       </w:r>
@@ -450,11 +750,9 @@
           <w:numId w:val="1"/>
         </w:numPr>
       </w:pPr>
-      <w:proofErr w:type="gramStart"/>
-      <w:r>
-        <w:t>39 year old</w:t>
-      </w:r>
-      <w:proofErr w:type="gramEnd"/>
+      <w:r>
+        <w:t>39-year-old</w:t>
+      </w:r>
       <w:r>
         <w:t xml:space="preserve"> Software project manager </w:t>
       </w:r>
@@ -560,11 +858,9 @@
           <w:numId w:val="1"/>
         </w:numPr>
       </w:pPr>
-      <w:proofErr w:type="gramStart"/>
-      <w:r>
-        <w:t>37 year old</w:t>
-      </w:r>
-      <w:proofErr w:type="gramEnd"/>
+      <w:r>
+        <w:t>37-year-old</w:t>
+      </w:r>
       <w:r>
         <w:t xml:space="preserve"> ER nurse </w:t>
       </w:r>
@@ -590,6 +886,7 @@
         <w:rPr>
           <w:noProof/>
         </w:rPr>
+        <w:lastRenderedPageBreak/>
         <w:drawing>
           <wp:inline distT="0" distB="0" distL="0" distR="0" wp14:anchorId="17E95735" wp14:editId="6D3981B2">
             <wp:extent cx="3587221" cy="2011680"/>

</xml_diff>